<commit_message>
done New formKFR & form Program Terapi
</commit_message>
<xml_diff>
--- a/public/doc/input/rehabmedik/cetakNewFormProgramTerapi.docx
+++ b/public/doc/input/rehabmedik/cetakNewFormProgramTerapi.docx
@@ -91,6 +91,7 @@
           <w:lang w:val="en-US"/>
         </w:rPr>
       </w:pPr>
+      <w:proofErr w:type="spellStart"/>
       <w:r>
         <w:rPr>
           <w:rFonts w:ascii="Bookman Old Style" w:hAnsi="Bookman Old Style"/>
@@ -98,8 +99,29 @@
           <w:bCs/>
           <w:lang w:val="en-US"/>
         </w:rPr>
-        <w:t>Identitas Pasien</w:t>
-      </w:r>
+        <w:t>Identitas</w:t>
+      </w:r>
+      <w:proofErr w:type="spellEnd"/>
+      <w:r>
+        <w:rPr>
+          <w:rFonts w:ascii="Bookman Old Style" w:hAnsi="Bookman Old Style"/>
+          <w:b/>
+          <w:bCs/>
+          <w:lang w:val="en-US"/>
+        </w:rPr>
+        <w:t xml:space="preserve"> </w:t>
+      </w:r>
+      <w:proofErr w:type="spellStart"/>
+      <w:r>
+        <w:rPr>
+          <w:rFonts w:ascii="Bookman Old Style" w:hAnsi="Bookman Old Style"/>
+          <w:b/>
+          <w:bCs/>
+          <w:lang w:val="en-US"/>
+        </w:rPr>
+        <w:t>Pasien</w:t>
+      </w:r>
+      <w:proofErr w:type="spellEnd"/>
     </w:p>
     <w:p>
       <w:pPr>
@@ -114,13 +136,47 @@
           <w:lang w:val="en-US"/>
         </w:rPr>
       </w:pPr>
-      <w:r>
-        <w:rPr>
-          <w:rFonts w:ascii="Bookman Old Style" w:hAnsi="Bookman Old Style"/>
-          <w:lang w:val="en-US"/>
-        </w:rPr>
-        <w:t>Nomor Rekam Medis</w:t>
-      </w:r>
+      <w:proofErr w:type="spellStart"/>
+      <w:r>
+        <w:rPr>
+          <w:rFonts w:ascii="Bookman Old Style" w:hAnsi="Bookman Old Style"/>
+          <w:lang w:val="en-US"/>
+        </w:rPr>
+        <w:t>Nomor</w:t>
+      </w:r>
+      <w:proofErr w:type="spellEnd"/>
+      <w:r>
+        <w:rPr>
+          <w:rFonts w:ascii="Bookman Old Style" w:hAnsi="Bookman Old Style"/>
+          <w:lang w:val="en-US"/>
+        </w:rPr>
+        <w:t xml:space="preserve"> </w:t>
+      </w:r>
+      <w:proofErr w:type="spellStart"/>
+      <w:r>
+        <w:rPr>
+          <w:rFonts w:ascii="Bookman Old Style" w:hAnsi="Bookman Old Style"/>
+          <w:lang w:val="en-US"/>
+        </w:rPr>
+        <w:t>Rekam</w:t>
+      </w:r>
+      <w:proofErr w:type="spellEnd"/>
+      <w:r>
+        <w:rPr>
+          <w:rFonts w:ascii="Bookman Old Style" w:hAnsi="Bookman Old Style"/>
+          <w:lang w:val="en-US"/>
+        </w:rPr>
+        <w:t xml:space="preserve"> </w:t>
+      </w:r>
+      <w:proofErr w:type="spellStart"/>
+      <w:r>
+        <w:rPr>
+          <w:rFonts w:ascii="Bookman Old Style" w:hAnsi="Bookman Old Style"/>
+          <w:lang w:val="en-US"/>
+        </w:rPr>
+        <w:t>Medis</w:t>
+      </w:r>
+      <w:proofErr w:type="spellEnd"/>
       <w:r>
         <w:rPr>
           <w:rFonts w:ascii="Bookman Old Style" w:hAnsi="Bookman Old Style"/>
@@ -162,8 +218,17 @@
           <w:rFonts w:ascii="Bookman Old Style" w:hAnsi="Bookman Old Style"/>
           <w:lang w:val="en-US"/>
         </w:rPr>
-        <w:t xml:space="preserve"> Lengkap</w:t>
-      </w:r>
+        <w:t xml:space="preserve"> </w:t>
+      </w:r>
+      <w:proofErr w:type="spellStart"/>
+      <w:r>
+        <w:rPr>
+          <w:rFonts w:ascii="Bookman Old Style" w:hAnsi="Bookman Old Style"/>
+          <w:lang w:val="en-US"/>
+        </w:rPr>
+        <w:t>Lengkap</w:t>
+      </w:r>
+      <w:proofErr w:type="spellEnd"/>
       <w:r>
         <w:rPr>
           <w:rFonts w:ascii="Bookman Old Style" w:hAnsi="Bookman Old Style"/>
@@ -199,20 +264,38 @@
           <w:lang w:val="en-US"/>
         </w:rPr>
       </w:pPr>
-      <w:r>
-        <w:rPr>
-          <w:rFonts w:ascii="Bookman Old Style" w:hAnsi="Bookman Old Style"/>
-          <w:lang w:val="en-US"/>
-        </w:rPr>
-        <w:t>Tanggal Lahir</w:t>
-      </w:r>
-      <w:r>
-        <w:rPr>
-          <w:rFonts w:ascii="Bookman Old Style" w:hAnsi="Bookman Old Style"/>
-          <w:lang w:val="en-US"/>
-        </w:rPr>
-        <w:t xml:space="preserve"> / Umur</w:t>
-      </w:r>
+      <w:proofErr w:type="spellStart"/>
+      <w:r>
+        <w:rPr>
+          <w:rFonts w:ascii="Bookman Old Style" w:hAnsi="Bookman Old Style"/>
+          <w:lang w:val="en-US"/>
+        </w:rPr>
+        <w:t>Tanggal</w:t>
+      </w:r>
+      <w:proofErr w:type="spellEnd"/>
+      <w:r>
+        <w:rPr>
+          <w:rFonts w:ascii="Bookman Old Style" w:hAnsi="Bookman Old Style"/>
+          <w:lang w:val="en-US"/>
+        </w:rPr>
+        <w:t xml:space="preserve"> Lahir</w:t>
+      </w:r>
+      <w:r>
+        <w:rPr>
+          <w:rFonts w:ascii="Bookman Old Style" w:hAnsi="Bookman Old Style"/>
+          <w:lang w:val="en-US"/>
+        </w:rPr>
+        <w:t xml:space="preserve"> / </w:t>
+      </w:r>
+      <w:proofErr w:type="spellStart"/>
+      <w:r>
+        <w:rPr>
+          <w:rFonts w:ascii="Bookman Old Style" w:hAnsi="Bookman Old Style"/>
+          <w:lang w:val="en-US"/>
+        </w:rPr>
+        <w:t>Umur</w:t>
+      </w:r>
+      <w:proofErr w:type="spellEnd"/>
       <w:r>
         <w:rPr>
           <w:rFonts w:ascii="Bookman Old Style" w:hAnsi="Bookman Old Style"/>
@@ -322,6 +405,7 @@
     <w:p>
       <w:pPr>
         <w:pStyle w:val="ListParagraph"/>
+        <w:spacing w:line="360" w:lineRule="auto"/>
         <w:ind w:left="142" w:right="425"/>
         <w:rPr>
           <w:rFonts w:ascii="Bookman Old Style" w:hAnsi="Bookman Old Style"/>
@@ -343,6 +427,7 @@
     <w:p>
       <w:pPr>
         <w:pStyle w:val="ListParagraph"/>
+        <w:spacing w:line="360" w:lineRule="auto"/>
         <w:ind w:left="142" w:right="425"/>
         <w:rPr>
           <w:rFonts w:ascii="Bookman Old Style" w:hAnsi="Bookman Old Style"/>
@@ -362,6 +447,168 @@
           <w:lang w:val="en-US"/>
         </w:rPr>
         <w:t>SUBYEKTIF</w:t>
+      </w:r>
+      <w:r>
+        <w:rPr>
+          <w:rFonts w:ascii="Bookman Old Style" w:hAnsi="Bookman Old Style"/>
+          <w:lang w:val="en-US"/>
+        </w:rPr>
+        <w:t>}</w:t>
+      </w:r>
+    </w:p>
+    <w:p>
+      <w:pPr>
+        <w:pStyle w:val="ListParagraph"/>
+        <w:spacing w:line="360" w:lineRule="auto"/>
+        <w:ind w:left="142" w:right="425"/>
+        <w:rPr>
+          <w:rFonts w:ascii="Bookman Old Style" w:hAnsi="Bookman Old Style"/>
+          <w:b/>
+          <w:bCs/>
+          <w:lang w:val="en-US"/>
+        </w:rPr>
+      </w:pPr>
+      <w:r>
+        <w:rPr>
+          <w:rFonts w:ascii="Bookman Old Style" w:hAnsi="Bookman Old Style"/>
+          <w:b/>
+          <w:bCs/>
+          <w:lang w:val="en-US"/>
+        </w:rPr>
+        <w:t>Objective</w:t>
+      </w:r>
+    </w:p>
+    <w:p>
+      <w:pPr>
+        <w:pStyle w:val="ListParagraph"/>
+        <w:spacing w:line="360" w:lineRule="auto"/>
+        <w:ind w:left="142" w:right="425"/>
+        <w:rPr>
+          <w:rFonts w:ascii="Bookman Old Style" w:hAnsi="Bookman Old Style"/>
+          <w:lang w:val="en-US"/>
+        </w:rPr>
+      </w:pPr>
+      <w:r>
+        <w:rPr>
+          <w:rFonts w:ascii="Bookman Old Style" w:hAnsi="Bookman Old Style"/>
+          <w:lang w:val="en-US"/>
+        </w:rPr>
+        <w:t>${</w:t>
+      </w:r>
+      <w:r>
+        <w:rPr>
+          <w:rFonts w:ascii="Bookman Old Style" w:hAnsi="Bookman Old Style"/>
+          <w:lang w:val="en-US"/>
+        </w:rPr>
+        <w:t>OBYEKTIF</w:t>
+      </w:r>
+      <w:r>
+        <w:rPr>
+          <w:rFonts w:ascii="Bookman Old Style" w:hAnsi="Bookman Old Style"/>
+          <w:lang w:val="en-US"/>
+        </w:rPr>
+        <w:t>}</w:t>
+      </w:r>
+    </w:p>
+    <w:p>
+      <w:pPr>
+        <w:pStyle w:val="ListParagraph"/>
+        <w:spacing w:line="360" w:lineRule="auto"/>
+        <w:ind w:left="142" w:right="425"/>
+        <w:rPr>
+          <w:rFonts w:ascii="Bookman Old Style" w:hAnsi="Bookman Old Style"/>
+          <w:b/>
+          <w:bCs/>
+          <w:lang w:val="en-US"/>
+        </w:rPr>
+      </w:pPr>
+      <w:r>
+        <w:rPr>
+          <w:rFonts w:ascii="Bookman Old Style" w:hAnsi="Bookman Old Style"/>
+          <w:b/>
+          <w:bCs/>
+          <w:lang w:val="en-US"/>
+        </w:rPr>
+        <w:t>Assessment</w:t>
+      </w:r>
+    </w:p>
+    <w:p>
+      <w:pPr>
+        <w:pStyle w:val="ListParagraph"/>
+        <w:spacing w:line="360" w:lineRule="auto"/>
+        <w:ind w:left="142" w:right="425"/>
+        <w:rPr>
+          <w:rFonts w:ascii="Bookman Old Style" w:hAnsi="Bookman Old Style"/>
+          <w:lang w:val="en-US"/>
+        </w:rPr>
+      </w:pPr>
+      <w:r>
+        <w:rPr>
+          <w:rFonts w:ascii="Bookman Old Style" w:hAnsi="Bookman Old Style"/>
+          <w:lang w:val="en-US"/>
+        </w:rPr>
+        <w:t>${</w:t>
+      </w:r>
+      <w:r>
+        <w:rPr>
+          <w:rFonts w:ascii="Bookman Old Style" w:hAnsi="Bookman Old Style"/>
+          <w:lang w:val="en-US"/>
+        </w:rPr>
+        <w:t>ASSESMENT</w:t>
+      </w:r>
+      <w:r>
+        <w:rPr>
+          <w:rFonts w:ascii="Bookman Old Style" w:hAnsi="Bookman Old Style"/>
+          <w:lang w:val="en-US"/>
+        </w:rPr>
+        <w:t>}</w:t>
+      </w:r>
+    </w:p>
+    <w:p>
+      <w:pPr>
+        <w:pStyle w:val="ListParagraph"/>
+        <w:spacing w:line="360" w:lineRule="auto"/>
+        <w:ind w:left="142" w:right="425"/>
+        <w:rPr>
+          <w:rFonts w:ascii="Bookman Old Style" w:hAnsi="Bookman Old Style"/>
+          <w:b/>
+          <w:bCs/>
+          <w:lang w:val="en-US"/>
+        </w:rPr>
+      </w:pPr>
+      <w:r>
+        <w:rPr>
+          <w:rFonts w:ascii="Bookman Old Style" w:hAnsi="Bookman Old Style"/>
+          <w:b/>
+          <w:bCs/>
+          <w:lang w:val="en-US"/>
+        </w:rPr>
+        <w:t>Procedure</w:t>
+      </w:r>
+    </w:p>
+    <w:p>
+      <w:pPr>
+        <w:pStyle w:val="ListParagraph"/>
+        <w:spacing w:line="360" w:lineRule="auto"/>
+        <w:ind w:left="142" w:right="425"/>
+        <w:rPr>
+          <w:rFonts w:ascii="Bookman Old Style" w:hAnsi="Bookman Old Style"/>
+          <w:lang w:val="en-US"/>
+        </w:rPr>
+      </w:pPr>
+      <w:r>
+        <w:rPr>
+          <w:rFonts w:ascii="Bookman Old Style" w:hAnsi="Bookman Old Style"/>
+          <w:lang w:val="en-US"/>
+        </w:rPr>
+        <w:t>${</w:t>
+      </w:r>
+      <w:r>
+        <w:rPr>
+          <w:rFonts w:ascii="Bookman Old Style" w:hAnsi="Bookman Old Style"/>
+          <w:lang w:val="en-US"/>
+        </w:rPr>
+        <w:t>PROCEDURE</w:t>
       </w:r>
       <w:r>
         <w:rPr>
@@ -377,162 +624,6 @@
         <w:ind w:left="142" w:right="425"/>
         <w:rPr>
           <w:rFonts w:ascii="Bookman Old Style" w:hAnsi="Bookman Old Style"/>
-          <w:b/>
-          <w:bCs/>
-          <w:lang w:val="en-US"/>
-        </w:rPr>
-      </w:pPr>
-      <w:r>
-        <w:rPr>
-          <w:rFonts w:ascii="Bookman Old Style" w:hAnsi="Bookman Old Style"/>
-          <w:b/>
-          <w:bCs/>
-          <w:lang w:val="en-US"/>
-        </w:rPr>
-        <w:t>Objective</w:t>
-      </w:r>
-    </w:p>
-    <w:p>
-      <w:pPr>
-        <w:pStyle w:val="ListParagraph"/>
-        <w:ind w:left="142" w:right="425"/>
-        <w:rPr>
-          <w:rFonts w:ascii="Bookman Old Style" w:hAnsi="Bookman Old Style"/>
-          <w:lang w:val="en-US"/>
-        </w:rPr>
-      </w:pPr>
-      <w:r>
-        <w:rPr>
-          <w:rFonts w:ascii="Bookman Old Style" w:hAnsi="Bookman Old Style"/>
-          <w:lang w:val="en-US"/>
-        </w:rPr>
-        <w:t>${</w:t>
-      </w:r>
-      <w:r>
-        <w:rPr>
-          <w:rFonts w:ascii="Bookman Old Style" w:hAnsi="Bookman Old Style"/>
-          <w:lang w:val="en-US"/>
-        </w:rPr>
-        <w:t>OBYEKTIF</w:t>
-      </w:r>
-      <w:r>
-        <w:rPr>
-          <w:rFonts w:ascii="Bookman Old Style" w:hAnsi="Bookman Old Style"/>
-          <w:lang w:val="en-US"/>
-        </w:rPr>
-        <w:t>}</w:t>
-      </w:r>
-    </w:p>
-    <w:p>
-      <w:pPr>
-        <w:pStyle w:val="ListParagraph"/>
-        <w:ind w:left="142" w:right="425"/>
-        <w:rPr>
-          <w:rFonts w:ascii="Bookman Old Style" w:hAnsi="Bookman Old Style"/>
-          <w:b/>
-          <w:bCs/>
-          <w:lang w:val="en-US"/>
-        </w:rPr>
-      </w:pPr>
-      <w:r>
-        <w:rPr>
-          <w:rFonts w:ascii="Bookman Old Style" w:hAnsi="Bookman Old Style"/>
-          <w:b/>
-          <w:bCs/>
-          <w:lang w:val="en-US"/>
-        </w:rPr>
-        <w:t>Assessment</w:t>
-      </w:r>
-    </w:p>
-    <w:p>
-      <w:pPr>
-        <w:pStyle w:val="ListParagraph"/>
-        <w:ind w:left="142" w:right="425"/>
-        <w:rPr>
-          <w:rFonts w:ascii="Bookman Old Style" w:hAnsi="Bookman Old Style"/>
-          <w:lang w:val="en-US"/>
-        </w:rPr>
-      </w:pPr>
-      <w:r>
-        <w:rPr>
-          <w:rFonts w:ascii="Bookman Old Style" w:hAnsi="Bookman Old Style"/>
-          <w:lang w:val="en-US"/>
-        </w:rPr>
-        <w:t>${</w:t>
-      </w:r>
-      <w:r>
-        <w:rPr>
-          <w:rFonts w:ascii="Bookman Old Style" w:hAnsi="Bookman Old Style"/>
-          <w:lang w:val="en-US"/>
-        </w:rPr>
-        <w:t>ASSESMENT</w:t>
-      </w:r>
-      <w:r>
-        <w:rPr>
-          <w:rFonts w:ascii="Bookman Old Style" w:hAnsi="Bookman Old Style"/>
-          <w:lang w:val="en-US"/>
-        </w:rPr>
-        <w:t>}</w:t>
-      </w:r>
-    </w:p>
-    <w:p>
-      <w:pPr>
-        <w:pStyle w:val="ListParagraph"/>
-        <w:ind w:left="142" w:right="425"/>
-        <w:rPr>
-          <w:rFonts w:ascii="Bookman Old Style" w:hAnsi="Bookman Old Style"/>
-          <w:b/>
-          <w:bCs/>
-          <w:lang w:val="en-US"/>
-        </w:rPr>
-      </w:pPr>
-      <w:r>
-        <w:rPr>
-          <w:rFonts w:ascii="Bookman Old Style" w:hAnsi="Bookman Old Style"/>
-          <w:b/>
-          <w:bCs/>
-          <w:lang w:val="en-US"/>
-        </w:rPr>
-        <w:t>Procedure</w:t>
-      </w:r>
-    </w:p>
-    <w:p>
-      <w:pPr>
-        <w:pStyle w:val="ListParagraph"/>
-        <w:ind w:left="142" w:right="425"/>
-        <w:rPr>
-          <w:rFonts w:ascii="Bookman Old Style" w:hAnsi="Bookman Old Style"/>
-          <w:lang w:val="en-US"/>
-        </w:rPr>
-      </w:pPr>
-      <w:r>
-        <w:rPr>
-          <w:rFonts w:ascii="Bookman Old Style" w:hAnsi="Bookman Old Style"/>
-          <w:lang w:val="en-US"/>
-        </w:rPr>
-        <w:t>${</w:t>
-      </w:r>
-      <w:r>
-        <w:rPr>
-          <w:rFonts w:ascii="Bookman Old Style" w:hAnsi="Bookman Old Style"/>
-          <w:lang w:val="en-US"/>
-        </w:rPr>
-        <w:t>PROCEDURE</w:t>
-      </w:r>
-      <w:r>
-        <w:rPr>
-          <w:rFonts w:ascii="Bookman Old Style" w:hAnsi="Bookman Old Style"/>
-          <w:lang w:val="en-US"/>
-        </w:rPr>
-        <w:t>}</w:t>
-      </w:r>
-    </w:p>
-    <w:p>
-      <w:pPr>
-        <w:pStyle w:val="ListParagraph"/>
-        <w:ind w:left="142" w:right="425"/>
-        <w:rPr>
-          <w:rFonts w:ascii="Bookman Old Style" w:hAnsi="Bookman Old Style"/>
           <w:lang w:val="en-US"/>
         </w:rPr>
       </w:pPr>
@@ -545,12 +636,21 @@
           <w:lang w:val="en-US"/>
         </w:rPr>
       </w:pPr>
-      <w:r>
-        <w:rPr>
-          <w:rFonts w:ascii="Bookman Old Style" w:hAnsi="Bookman Old Style"/>
-          <w:lang w:val="en-US"/>
-        </w:rPr>
-        <w:t xml:space="preserve">Sukoharjo, </w:t>
+      <w:proofErr w:type="spellStart"/>
+      <w:r>
+        <w:rPr>
+          <w:rFonts w:ascii="Bookman Old Style" w:hAnsi="Bookman Old Style"/>
+          <w:lang w:val="en-US"/>
+        </w:rPr>
+        <w:t>Sukoharjo</w:t>
+      </w:r>
+      <w:proofErr w:type="spellEnd"/>
+      <w:r>
+        <w:rPr>
+          <w:rFonts w:ascii="Bookman Old Style" w:hAnsi="Bookman Old Style"/>
+          <w:lang w:val="en-US"/>
+        </w:rPr>
+        <w:t xml:space="preserve">, </w:t>
       </w:r>
       <w:r>
         <w:rPr>
@@ -604,13 +704,31 @@
         </w:rPr>
         <w:t xml:space="preserve">Dokter </w:t>
       </w:r>
-      <w:r>
-        <w:rPr>
-          <w:rFonts w:ascii="Bookman Old Style" w:hAnsi="Bookman Old Style"/>
-          <w:lang w:val="en-US"/>
-        </w:rPr>
-        <w:t>Penanggung Jawab Pelayanan</w:t>
-      </w:r>
+      <w:proofErr w:type="spellStart"/>
+      <w:r>
+        <w:rPr>
+          <w:rFonts w:ascii="Bookman Old Style" w:hAnsi="Bookman Old Style"/>
+          <w:lang w:val="en-US"/>
+        </w:rPr>
+        <w:t>Penanggung</w:t>
+      </w:r>
+      <w:proofErr w:type="spellEnd"/>
+      <w:r>
+        <w:rPr>
+          <w:rFonts w:ascii="Bookman Old Style" w:hAnsi="Bookman Old Style"/>
+          <w:lang w:val="en-US"/>
+        </w:rPr>
+        <w:t xml:space="preserve"> Jawab </w:t>
+      </w:r>
+      <w:proofErr w:type="spellStart"/>
+      <w:r>
+        <w:rPr>
+          <w:rFonts w:ascii="Bookman Old Style" w:hAnsi="Bookman Old Style"/>
+          <w:lang w:val="en-US"/>
+        </w:rPr>
+        <w:t>Pelayanan</w:t>
+      </w:r>
+      <w:proofErr w:type="spellEnd"/>
     </w:p>
     <w:p>
       <w:pPr>
@@ -635,9 +753,9 @@
         <w:jc w:val="center"/>
         <w:rPr>
           <w:rFonts w:ascii="Bookman Old Style" w:hAnsi="Bookman Old Style"/>
-          <w:lang w:val="en-US"/>
-        </w:rPr>
-      </w:pPr>
+        </w:rPr>
+      </w:pPr>
+      <w:proofErr w:type="gramStart"/>
       <w:r>
         <w:rPr>
           <w:rFonts w:ascii="Bookman Old Style" w:hAnsi="Bookman Old Style"/>
@@ -656,8 +774,57 @@
         <w:rPr>
           <w:rFonts w:ascii="Bookman Old Style" w:hAnsi="Bookman Old Style"/>
         </w:rPr>
-        <w:t>${NAMADOKTER}</w:t>
-      </w:r>
+        <w:t>$</w:t>
+      </w:r>
+      <w:proofErr w:type="gramEnd"/>
+      <w:r>
+        <w:rPr>
+          <w:rFonts w:ascii="Bookman Old Style" w:hAnsi="Bookman Old Style"/>
+        </w:rPr>
+        <w:t>{NAMADOKTER}</w:t>
+      </w:r>
+    </w:p>
+    <w:p>
+      <w:pPr>
+        <w:ind w:right="425" w:hanging="142"/>
+        <w:jc w:val="center"/>
+        <w:rPr>
+          <w:rFonts w:ascii="Bookman Old Style" w:hAnsi="Bookman Old Style"/>
+          <w:lang w:val="en-US"/>
+        </w:rPr>
+      </w:pPr>
+      <w:r>
+        <w:rPr>
+          <w:rFonts w:ascii="Bookman Old Style" w:hAnsi="Bookman Old Style"/>
+          <w:lang w:val="en-US"/>
+        </w:rPr>
+        <w:t xml:space="preserve">Nama Tim </w:t>
+      </w:r>
+      <w:proofErr w:type="spellStart"/>
+      <w:r>
+        <w:rPr>
+          <w:rFonts w:ascii="Bookman Old Style" w:hAnsi="Bookman Old Style"/>
+          <w:lang w:val="en-US"/>
+        </w:rPr>
+        <w:t>Rehabilitasi</w:t>
+      </w:r>
+      <w:proofErr w:type="spellEnd"/>
+      <w:r>
+        <w:rPr>
+          <w:rFonts w:ascii="Bookman Old Style" w:hAnsi="Bookman Old Style"/>
+          <w:lang w:val="en-US"/>
+        </w:rPr>
+        <w:t xml:space="preserve"> </w:t>
+      </w:r>
+      <w:proofErr w:type="spellStart"/>
+      <w:r>
+        <w:rPr>
+          <w:rFonts w:ascii="Bookman Old Style" w:hAnsi="Bookman Old Style"/>
+          <w:lang w:val="en-US"/>
+        </w:rPr>
+        <w:t>Medik</w:t>
+      </w:r>
+      <w:proofErr w:type="spellEnd"/>
     </w:p>
     <w:p>
       <w:pPr>
@@ -668,6 +835,27 @@
           <w:lang w:val="en-US"/>
         </w:rPr>
       </w:pPr>
+      <w:r>
+        <w:rPr>
+          <w:rFonts w:ascii="Bookman Old Style" w:hAnsi="Bookman Old Style"/>
+          <w:lang w:val="en-US"/>
+        </w:rPr>
+        <w:t>${PATH_TTE_</w:t>
+      </w:r>
+      <w:r>
+        <w:rPr>
+          <w:rFonts w:ascii="Bookman Old Style" w:hAnsi="Bookman Old Style"/>
+          <w:lang w:val="en-US"/>
+        </w:rPr>
+        <w:t>TIM</w:t>
+      </w:r>
+      <w:r>
+        <w:rPr>
+          <w:rFonts w:ascii="Bookman Old Style" w:hAnsi="Bookman Old Style"/>
+          <w:lang w:val="en-US"/>
+        </w:rPr>
+        <w:t>}</w:t>
+      </w:r>
     </w:p>
     <w:p>
       <w:pPr>
@@ -678,6 +866,61 @@
           <w:lang w:val="en-US"/>
         </w:rPr>
       </w:pPr>
+      <w:proofErr w:type="gramStart"/>
+      <w:r>
+        <w:rPr>
+          <w:rFonts w:ascii="Bookman Old Style" w:hAnsi="Bookman Old Style"/>
+          <w:lang w:val="en-US"/>
+        </w:rPr>
+        <w:t>(</w:t>
+      </w:r>
+      <w:r>
+        <w:rPr>
+          <w:rFonts w:ascii="Bookman Old Style" w:hAnsi="Bookman Old Style"/>
+          <w:lang w:val="en-US"/>
+        </w:rPr>
+        <w:t xml:space="preserve"> </w:t>
+      </w:r>
+      <w:r>
+        <w:rPr>
+          <w:rFonts w:ascii="Bookman Old Style" w:hAnsi="Bookman Old Style"/>
+        </w:rPr>
+        <w:t>$</w:t>
+      </w:r>
+      <w:proofErr w:type="gramEnd"/>
+      <w:r>
+        <w:rPr>
+          <w:rFonts w:ascii="Bookman Old Style" w:hAnsi="Bookman Old Style"/>
+        </w:rPr>
+        <w:t>{</w:t>
+      </w:r>
+      <w:r>
+        <w:rPr>
+          <w:rFonts w:ascii="Bookman Old Style" w:hAnsi="Bookman Old Style"/>
+          <w:lang w:val="en-US"/>
+        </w:rPr>
+        <w:t>NAMATIM</w:t>
+      </w:r>
+      <w:r>
+        <w:rPr>
+          <w:rFonts w:ascii="Bookman Old Style" w:hAnsi="Bookman Old Style"/>
+        </w:rPr>
+        <w:t>}</w:t>
+      </w:r>
+      <w:r>
+        <w:rPr>
+          <w:rFonts w:ascii="Bookman Old Style" w:hAnsi="Bookman Old Style"/>
+          <w:lang w:val="en-US"/>
+        </w:rPr>
+        <w:t xml:space="preserve"> </w:t>
+      </w:r>
+      <w:r>
+        <w:rPr>
+          <w:rFonts w:ascii="Bookman Old Style" w:hAnsi="Bookman Old Style"/>
+          <w:lang w:val="en-US"/>
+        </w:rPr>
+        <w:t>)</w:t>
+      </w:r>
     </w:p>
     <w:p>
       <w:pPr>
@@ -687,6 +930,14 @@
           <w:rFonts w:ascii="Bookman Old Style" w:hAnsi="Bookman Old Style"/>
           <w:lang w:val="en-US"/>
         </w:rPr>
+        <w:sectPr>
+          <w:headerReference w:type="default" r:id="rId8"/>
+          <w:type w:val="continuous"/>
+          <w:pgSz w:w="12191" w:h="18711" w:code="148"/>
+          <w:pgMar w:top="1134" w:right="567" w:bottom="1701" w:left="1134" w:header="284" w:footer="709" w:gutter="0"/>
+          <w:cols w:num="2" w:space="708"/>
+          <w:docGrid w:linePitch="360"/>
+        </w:sectPr>
       </w:pPr>
     </w:p>
     <w:p>
@@ -699,210 +950,11 @@
         </w:rPr>
       </w:pPr>
     </w:p>
-    <w:p>
-      <w:pPr>
-        <w:ind w:right="425"/>
-        <w:jc w:val="center"/>
-        <w:rPr>
-          <w:rFonts w:ascii="Bookman Old Style" w:hAnsi="Bookman Old Style"/>
-          <w:lang w:val="en-US"/>
-        </w:rPr>
-      </w:pPr>
-    </w:p>
-    <w:p>
-      <w:pPr>
-        <w:ind w:right="425"/>
-        <w:jc w:val="center"/>
-        <w:rPr>
-          <w:rFonts w:ascii="Bookman Old Style" w:hAnsi="Bookman Old Style"/>
-          <w:lang w:val="en-US"/>
-        </w:rPr>
-      </w:pPr>
-    </w:p>
-    <w:p>
-      <w:pPr>
-        <w:ind w:right="425"/>
-        <w:jc w:val="center"/>
-        <w:rPr>
-          <w:rFonts w:ascii="Bookman Old Style" w:hAnsi="Bookman Old Style"/>
-          <w:lang w:val="en-US"/>
-        </w:rPr>
-      </w:pPr>
-    </w:p>
-    <w:p>
-      <w:pPr>
-        <w:ind w:right="425"/>
-        <w:jc w:val="center"/>
-        <w:rPr>
-          <w:rFonts w:ascii="Bookman Old Style" w:hAnsi="Bookman Old Style"/>
-          <w:lang w:val="en-US"/>
-        </w:rPr>
-      </w:pPr>
-    </w:p>
-    <w:p>
-      <w:pPr>
-        <w:ind w:right="425"/>
-        <w:jc w:val="center"/>
-        <w:rPr>
-          <w:rFonts w:ascii="Bookman Old Style" w:hAnsi="Bookman Old Style"/>
-          <w:lang w:val="en-US"/>
-        </w:rPr>
-      </w:pPr>
-    </w:p>
-    <w:p>
-      <w:pPr>
-        <w:ind w:right="425"/>
-        <w:jc w:val="center"/>
-        <w:rPr>
-          <w:rFonts w:ascii="Bookman Old Style" w:hAnsi="Bookman Old Style"/>
-          <w:lang w:val="en-US"/>
-        </w:rPr>
-      </w:pPr>
-    </w:p>
-    <w:p>
-      <w:pPr>
-        <w:ind w:right="425"/>
-        <w:jc w:val="center"/>
-        <w:rPr>
-          <w:rFonts w:ascii="Bookman Old Style" w:hAnsi="Bookman Old Style"/>
-          <w:lang w:val="en-US"/>
-        </w:rPr>
-      </w:pPr>
-    </w:p>
-    <w:p>
-      <w:pPr>
-        <w:ind w:right="425"/>
-        <w:jc w:val="center"/>
-        <w:rPr>
-          <w:rFonts w:ascii="Bookman Old Style" w:hAnsi="Bookman Old Style"/>
-          <w:lang w:val="en-US"/>
-        </w:rPr>
-      </w:pPr>
-    </w:p>
-    <w:p>
-      <w:pPr>
-        <w:ind w:right="425"/>
-        <w:jc w:val="center"/>
-        <w:rPr>
-          <w:rFonts w:ascii="Bookman Old Style" w:hAnsi="Bookman Old Style"/>
-          <w:lang w:val="en-US"/>
-        </w:rPr>
-      </w:pPr>
-    </w:p>
-    <w:p>
-      <w:pPr>
-        <w:ind w:right="425"/>
-        <w:jc w:val="center"/>
-        <w:rPr>
-          <w:rFonts w:ascii="Bookman Old Style" w:hAnsi="Bookman Old Style"/>
-          <w:lang w:val="en-US"/>
-        </w:rPr>
-      </w:pPr>
-    </w:p>
-    <w:p>
-      <w:pPr>
-        <w:ind w:right="425"/>
-        <w:jc w:val="center"/>
-        <w:rPr>
-          <w:rFonts w:ascii="Bookman Old Style" w:hAnsi="Bookman Old Style"/>
-          <w:lang w:val="en-US"/>
-        </w:rPr>
-      </w:pPr>
-    </w:p>
-    <w:p>
-      <w:pPr>
-        <w:ind w:right="425"/>
-        <w:jc w:val="center"/>
-        <w:rPr>
-          <w:rFonts w:ascii="Bookman Old Style" w:hAnsi="Bookman Old Style"/>
-          <w:lang w:val="en-US"/>
-        </w:rPr>
-      </w:pPr>
-      <w:r>
-        <w:rPr>
-          <w:rFonts w:ascii="Bookman Old Style" w:hAnsi="Bookman Old Style"/>
-          <w:lang w:val="en-US"/>
-        </w:rPr>
-        <w:t>${PATH_TTE_</w:t>
-      </w:r>
-      <w:r>
-        <w:rPr>
-          <w:rFonts w:ascii="Bookman Old Style" w:hAnsi="Bookman Old Style"/>
-          <w:lang w:val="en-US"/>
-        </w:rPr>
-        <w:t>TIM</w:t>
-      </w:r>
-      <w:r>
-        <w:rPr>
-          <w:rFonts w:ascii="Bookman Old Style" w:hAnsi="Bookman Old Style"/>
-          <w:lang w:val="en-US"/>
-        </w:rPr>
-        <w:t>}</w:t>
-      </w:r>
-    </w:p>
-    <w:p>
-      <w:pPr>
-        <w:ind w:right="425"/>
-        <w:jc w:val="center"/>
-        <w:rPr>
-          <w:rFonts w:ascii="Bookman Old Style" w:hAnsi="Bookman Old Style"/>
-          <w:lang w:val="en-US"/>
-        </w:rPr>
-      </w:pPr>
-      <w:r>
-        <w:rPr>
-          <w:rFonts w:ascii="Bookman Old Style" w:hAnsi="Bookman Old Style"/>
-          <w:lang w:val="en-US"/>
-        </w:rPr>
-        <w:t>(</w:t>
-      </w:r>
-      <w:r>
-        <w:rPr>
-          <w:rFonts w:ascii="Bookman Old Style" w:hAnsi="Bookman Old Style"/>
-          <w:lang w:val="en-US"/>
-        </w:rPr>
-        <w:t xml:space="preserve"> </w:t>
-      </w:r>
-      <w:r>
-        <w:rPr>
-          <w:rFonts w:ascii="Bookman Old Style" w:hAnsi="Bookman Old Style"/>
-        </w:rPr>
-        <w:t>${</w:t>
-      </w:r>
-      <w:r>
-        <w:rPr>
-          <w:rFonts w:ascii="Bookman Old Style" w:hAnsi="Bookman Old Style"/>
-          <w:lang w:val="en-US"/>
-        </w:rPr>
-        <w:t>NAMATIM</w:t>
-      </w:r>
-      <w:r>
-        <w:rPr>
-          <w:rFonts w:ascii="Bookman Old Style" w:hAnsi="Bookman Old Style"/>
-        </w:rPr>
-        <w:t>}</w:t>
-      </w:r>
-      <w:r>
-        <w:rPr>
-          <w:rFonts w:ascii="Bookman Old Style" w:hAnsi="Bookman Old Style"/>
-          <w:lang w:val="en-US"/>
-        </w:rPr>
-        <w:t xml:space="preserve"> </w:t>
-      </w:r>
-      <w:r>
-        <w:rPr>
-          <w:rFonts w:ascii="Bookman Old Style" w:hAnsi="Bookman Old Style"/>
-          <w:lang w:val="en-US"/>
-        </w:rPr>
-        <w:t>)</w:t>
-      </w:r>
-    </w:p>
     <w:sectPr>
-      <w:headerReference w:type="default" r:id="rId8"/>
       <w:type w:val="continuous"/>
       <w:pgSz w:w="12191" w:h="18711" w:code="148"/>
       <w:pgMar w:top="1134" w:right="567" w:bottom="1701" w:left="1134" w:header="284" w:footer="709" w:gutter="0"/>
-      <w:cols w:num="2" w:space="708"/>
+      <w:cols w:space="708"/>
       <w:docGrid w:linePitch="360"/>
     </w:sectPr>
   </w:body>
@@ -1168,6 +1220,7 @@
       </w:rPr>
       <w:t>Email. pku.sukoharjo@gmail.com | Website. www.</w:t>
     </w:r>
+    <w:proofErr w:type="spellStart"/>
     <w:r>
       <w:rPr>
         <w:rFonts w:ascii="Calibri Light" w:hAnsi="Calibri Light"/>
@@ -1179,6 +1232,7 @@
       </w:rPr>
       <w:t>rs</w:t>
     </w:r>
+    <w:proofErr w:type="spellEnd"/>
     <w:r>
       <w:rPr>
         <w:rFonts w:ascii="Calibri Light" w:hAnsi="Calibri Light"/>
@@ -1233,7 +1287,7 @@
           <wp:extent cx="1073426" cy="1073426"/>
           <wp:effectExtent l="0" t="0" r="0" b="0"/>
           <wp:wrapNone/>
-          <wp:docPr id="8" name="Picture 8"/>
+          <wp:docPr id="3" name="Picture 3"/>
           <wp:cNvGraphicFramePr>
             <a:graphicFrameLocks xmlns:a="http://schemas.openxmlformats.org/drawingml/2006/main" noChangeAspect="1"/>
           </wp:cNvGraphicFramePr>
@@ -1408,6 +1462,7 @@
       </w:rPr>
       <w:t>Email. pku.sukoharjo@gmail.com | Website. www.</w:t>
     </w:r>
+    <w:proofErr w:type="spellStart"/>
     <w:r>
       <w:rPr>
         <w:rFonts w:ascii="Calibri Light" w:hAnsi="Calibri Light"/>
@@ -1419,6 +1474,7 @@
       </w:rPr>
       <w:t>rs</w:t>
     </w:r>
+    <w:proofErr w:type="spellEnd"/>
     <w:r>
       <w:rPr>
         <w:rFonts w:ascii="Calibri Light" w:hAnsi="Calibri Light"/>

</xml_diff>

<commit_message>
Revisi Done Tgl Form
Bertemu Dokter x Tidak Bertemu Dokter
</commit_message>
<xml_diff>
--- a/public/doc/input/rehabmedik/cetakNewFormProgramTerapi.docx
+++ b/public/doc/input/rehabmedik/cetakNewFormProgramTerapi.docx
@@ -621,6 +621,7 @@
     <w:p>
       <w:pPr>
         <w:pStyle w:val="ListParagraph"/>
+        <w:spacing w:after="0"/>
         <w:ind w:left="142" w:right="425"/>
         <w:rPr>
           <w:rFonts w:ascii="Bookman Old Style" w:hAnsi="Bookman Old Style"/>
@@ -631,50 +632,6 @@
     <w:p>
       <w:pPr>
         <w:ind w:right="425" w:firstLine="142"/>
-        <w:rPr>
-          <w:rFonts w:ascii="Bookman Old Style" w:hAnsi="Bookman Old Style"/>
-          <w:lang w:val="en-US"/>
-        </w:rPr>
-      </w:pPr>
-      <w:proofErr w:type="spellStart"/>
-      <w:r>
-        <w:rPr>
-          <w:rFonts w:ascii="Bookman Old Style" w:hAnsi="Bookman Old Style"/>
-          <w:lang w:val="en-US"/>
-        </w:rPr>
-        <w:t>Sukoharjo</w:t>
-      </w:r>
-      <w:proofErr w:type="spellEnd"/>
-      <w:r>
-        <w:rPr>
-          <w:rFonts w:ascii="Bookman Old Style" w:hAnsi="Bookman Old Style"/>
-          <w:lang w:val="en-US"/>
-        </w:rPr>
-        <w:t xml:space="preserve">, </w:t>
-      </w:r>
-      <w:r>
-        <w:rPr>
-          <w:rFonts w:ascii="Bookman Old Style" w:hAnsi="Bookman Old Style"/>
-        </w:rPr>
-        <w:t>${</w:t>
-      </w:r>
-      <w:r>
-        <w:rPr>
-          <w:rFonts w:ascii="Bookman Old Style" w:hAnsi="Bookman Old Style"/>
-          <w:lang w:val="en-US"/>
-        </w:rPr>
-        <w:t>TANGGAL</w:t>
-      </w:r>
-      <w:r>
-        <w:rPr>
-          <w:rFonts w:ascii="Bookman Old Style" w:hAnsi="Bookman Old Style"/>
-        </w:rPr>
-        <w:t>}</w:t>
-      </w:r>
-    </w:p>
-    <w:p>
-      <w:pPr>
-        <w:ind w:right="425"/>
         <w:rPr>
           <w:rFonts w:ascii="Bookman Old Style" w:hAnsi="Bookman Old Style"/>
           <w:lang w:val="en-US"/>
@@ -687,6 +644,41 @@
           <w:docGrid w:linePitch="360"/>
         </w:sectPr>
       </w:pPr>
+      <w:proofErr w:type="spellStart"/>
+      <w:r>
+        <w:rPr>
+          <w:rFonts w:ascii="Bookman Old Style" w:hAnsi="Bookman Old Style"/>
+          <w:lang w:val="en-US"/>
+        </w:rPr>
+        <w:t>Sukoharjo</w:t>
+      </w:r>
+      <w:proofErr w:type="spellEnd"/>
+      <w:r>
+        <w:rPr>
+          <w:rFonts w:ascii="Bookman Old Style" w:hAnsi="Bookman Old Style"/>
+          <w:lang w:val="en-US"/>
+        </w:rPr>
+        <w:t xml:space="preserve">, </w:t>
+      </w:r>
+      <w:r>
+        <w:rPr>
+          <w:rFonts w:ascii="Bookman Old Style" w:hAnsi="Bookman Old Style"/>
+        </w:rPr>
+        <w:t>${</w:t>
+      </w:r>
+      <w:r>
+        <w:rPr>
+          <w:rFonts w:ascii="Bookman Old Style" w:hAnsi="Bookman Old Style"/>
+          <w:lang w:val="en-US"/>
+        </w:rPr>
+        <w:t>TANGGAL</w:t>
+      </w:r>
+      <w:r>
+        <w:rPr>
+          <w:rFonts w:ascii="Bookman Old Style" w:hAnsi="Bookman Old Style"/>
+        </w:rPr>
+        <w:t>}</w:t>
+      </w:r>
     </w:p>
     <w:p>
       <w:pPr>
@@ -855,71 +847,6 @@
           <w:lang w:val="en-US"/>
         </w:rPr>
         <w:t>}</w:t>
-      </w:r>
-    </w:p>
-    <w:p>
-      <w:pPr>
-        <w:ind w:right="425"/>
-        <w:jc w:val="center"/>
-        <w:rPr>
-          <w:rFonts w:ascii="Bookman Old Style" w:hAnsi="Bookman Old Style"/>
-          <w:lang w:val="en-US"/>
-        </w:rPr>
-      </w:pPr>
-      <w:proofErr w:type="gramStart"/>
-      <w:r>
-        <w:rPr>
-          <w:rFonts w:ascii="Bookman Old Style" w:hAnsi="Bookman Old Style"/>
-          <w:lang w:val="en-US"/>
-        </w:rPr>
-        <w:t>(</w:t>
-      </w:r>
-      <w:r>
-        <w:rPr>
-          <w:rFonts w:ascii="Bookman Old Style" w:hAnsi="Bookman Old Style"/>
-          <w:lang w:val="en-US"/>
-        </w:rPr>
-        <w:t xml:space="preserve"> </w:t>
-      </w:r>
-      <w:r>
-        <w:rPr>
-          <w:rFonts w:ascii="Bookman Old Style" w:hAnsi="Bookman Old Style"/>
-        </w:rPr>
-        <w:t>$</w:t>
-      </w:r>
-      <w:proofErr w:type="gramEnd"/>
-      <w:r>
-        <w:rPr>
-          <w:rFonts w:ascii="Bookman Old Style" w:hAnsi="Bookman Old Style"/>
-        </w:rPr>
-        <w:t>{</w:t>
-      </w:r>
-      <w:r>
-        <w:rPr>
-          <w:rFonts w:ascii="Bookman Old Style" w:hAnsi="Bookman Old Style"/>
-          <w:lang w:val="en-US"/>
-        </w:rPr>
-        <w:t>NAMATIM</w:t>
-      </w:r>
-      <w:r>
-        <w:rPr>
-          <w:rFonts w:ascii="Bookman Old Style" w:hAnsi="Bookman Old Style"/>
-        </w:rPr>
-        <w:t>}</w:t>
-      </w:r>
-      <w:r>
-        <w:rPr>
-          <w:rFonts w:ascii="Bookman Old Style" w:hAnsi="Bookman Old Style"/>
-          <w:lang w:val="en-US"/>
-        </w:rPr>
-        <w:t xml:space="preserve"> </w:t>
-      </w:r>
-      <w:r>
-        <w:rPr>
-          <w:rFonts w:ascii="Bookman Old Style" w:hAnsi="Bookman Old Style"/>
-          <w:lang w:val="en-US"/>
-        </w:rPr>
-        <w:t>)</w:t>
       </w:r>
     </w:p>
     <w:p>
@@ -939,11 +866,51 @@
           <w:docGrid w:linePitch="360"/>
         </w:sectPr>
       </w:pPr>
+      <w:proofErr w:type="gramStart"/>
+      <w:r>
+        <w:rPr>
+          <w:rFonts w:ascii="Bookman Old Style" w:hAnsi="Bookman Old Style"/>
+          <w:lang w:val="en-US"/>
+        </w:rPr>
+        <w:t>(</w:t>
+      </w:r>
+      <w:r>
+        <w:rPr>
+          <w:rFonts w:ascii="Bookman Old Style" w:hAnsi="Bookman Old Style"/>
+          <w:lang w:val="en-US"/>
+        </w:rPr>
+        <w:t xml:space="preserve"> </w:t>
+      </w:r>
+      <w:r>
+        <w:rPr>
+          <w:rFonts w:ascii="Bookman Old Style" w:hAnsi="Bookman Old Style"/>
+        </w:rPr>
+        <w:t>$</w:t>
+      </w:r>
+      <w:proofErr w:type="gramEnd"/>
+      <w:r>
+        <w:rPr>
+          <w:rFonts w:ascii="Bookman Old Style" w:hAnsi="Bookman Old Style"/>
+        </w:rPr>
+        <w:t>{</w:t>
+      </w:r>
+      <w:r>
+        <w:rPr>
+          <w:rFonts w:ascii="Bookman Old Style" w:hAnsi="Bookman Old Style"/>
+          <w:lang w:val="en-US"/>
+        </w:rPr>
+        <w:t>NAMATIM</w:t>
+      </w:r>
+      <w:r>
+        <w:rPr>
+          <w:rFonts w:ascii="Bookman Old Style" w:hAnsi="Bookman Old Style"/>
+        </w:rPr>
+        <w:t>}</w:t>
+      </w:r>
     </w:p>
     <w:p>
       <w:pPr>
         <w:ind w:right="425"/>
-        <w:jc w:val="center"/>
         <w:rPr>
           <w:rFonts w:ascii="Bookman Old Style" w:hAnsi="Bookman Old Style"/>
           <w:lang w:val="en-US"/>

</xml_diff>